<commit_message>
feat: roxygen2 docs, pipeline wiring, practice-type classifier fix
- Add full roxygen2 tags (@title, @description, @param, @return, @details,
  @examples, @seealso) to all 50 functions across 12 utils_*.R files
- Wire 6 previously unwired scripts into 00_run_all.R: abstract text
  backfill (PubMed XML + ScienceDirect snippets), NPI matching, fidelity
  checks, gold standard validation, interrater agreement
- Fix practice_type classifier: international hospitals (non-US) now default
  to 'academic' instead of 'community'; pass country param through
  classify_practice_type(); removes spurious Cox HR for community
- ORCID search uses full initials (e.g. 'R.S.') instead of first letter only
  for higher specificity (174 vs 365 matches, fewer false positives)
- Update Cox model: community predictor removed, n_authors now significant
  (HR 1.25, p=0.006); RCT remains strongest predictor (HR 2.36, p=0.002)

Co-Authored-By: Claude Sonnet 4.6 <noreply@anthropic.com>
</commit_message>
<xml_diff>
--- a/docs/technical_appendix.docx
+++ b/docs/technical_appendix.docx
@@ -107,7 +107,7 @@
         </w:numPr>
       </w:pPr>
       <w:r>
-        <w:t xml:space="preserve">Disk cache: 1332 PubMed XML files, 1154 ScienceDirect HTML files</w:t>
+        <w:t xml:space="preserve">Disk cache: 1520 PubMed XML files, 1154 ScienceDirect HTML files</w:t>
       </w:r>
     </w:p>
     <w:p>
@@ -131,7 +131,7 @@
         </w:numPr>
       </w:pPr>
       <w:r>
-        <w:t xml:space="preserve">Runtime: approximately 3-4 hours for a full pipeline execution on 1106 abstracts</w:t>
+        <w:t xml:space="preserve">Runtime: approximately 3-4 hours for a full pipeline execution on 1069 abstracts</w:t>
       </w:r>
     </w:p>
     <w:bookmarkEnd w:id="10"/>
@@ -953,7 +953,7 @@
         <w:pStyle w:val="FirstParagraph"/>
       </w:pPr>
       <w:r>
-        <w:t xml:space="preserve">NCBI E-Utilities requests were rate-limited to 3 requests/second (without API key) or 10 requests/second (with ENTREZ_KEY). PubMed XML responses were cached to disk (1332 files). All search stages used RDS-based checkpoints enabling resume after interruption.</w:t>
+        <w:t xml:space="preserve">NCBI E-Utilities requests were rate-limited to 3 requests/second (without API key) or 10 requests/second (with ENTREZ_KEY). PubMed XML responses were cached to disk (1520 files). All search stages used RDS-based checkpoints enabling resume after interruption.</w:t>
       </w:r>
     </w:p>
     <w:bookmarkEnd w:id="15"/>
@@ -1831,7 +1831,7 @@
         <w:t xml:space="preserve"> </w:t>
       </w:r>
       <w:r>
-        <w:t xml:space="preserve">package. Pass 2: genderize.io API for international names not covered by SSA. Middle initials were stripped before lookup. Coverage: NaN%.</w:t>
+        <w:t xml:space="preserve">package. Pass 2: genderize.io API for international names not covered by SSA. Middle initials were stripped before lookup. Coverage: 17.6%.</w:t>
       </w:r>
     </w:p>
     <w:p>
@@ -1849,7 +1849,7 @@
         <w:t xml:space="preserve">Practice type</w:t>
       </w:r>
       <w:r>
-        <w:t xml:space="preserve">: Affiliations were cross-referenced against 2,754 ACGME-accredited teaching hospital names (derived from a validated classifier with 95% precision for Tier 1 institutions). Regex fallback identified university/medical school signals. Community hospitals were classified only when no university affiliation appeared in any listed affiliation. Coverage: NaN%.</w:t>
+        <w:t xml:space="preserve">: Affiliations were cross-referenced against 2,754 ACGME-accredited teaching hospital names (derived from a validated classifier with 95% precision for Tier 1 institutions). Regex fallback identified university/medical school signals. Community hospitals were classified only when no university affiliation appeared in any listed affiliation. Coverage: 17%.</w:t>
       </w:r>
     </w:p>
     <w:p>
@@ -1885,7 +1885,7 @@
         <w:t xml:space="preserve">Subspecialty</w:t>
       </w:r>
       <w:r>
-        <w:t xml:space="preserve">: Classified from departmental affiliation text: MIGS, REI, gynecologic oncology, FPMRS, MFM, family planning, general OB/GYN, obstetrics, urology, or surgery (other). Coverage: NaN%.</w:t>
+        <w:t xml:space="preserve">: Classified from departmental affiliation text: MIGS, REI, gynecologic oncology, FPMRS, MFM, family planning, general OB/GYN, obstetrics, urology, or surgery (other). Coverage: 15.7%.</w:t>
       </w:r>
     </w:p>
     <w:bookmarkEnd w:id="26"/>
@@ -2201,7 +2201,7 @@
               <w:jc w:val="right"/>
             </w:pPr>
             <w:r>
-              <w:t xml:space="preserve">1106</w:t>
+              <w:t xml:space="preserve">1069</w:t>
             </w:r>
           </w:p>
         </w:tc>
@@ -2213,7 +2213,7 @@
               <w:jc w:val="right"/>
             </w:pPr>
             <w:r>
-              <w:t xml:space="preserve">75</w:t>
+              <w:t xml:space="preserve">122</w:t>
             </w:r>
           </w:p>
         </w:tc>
@@ -2225,7 +2225,7 @@
               <w:jc w:val="right"/>
             </w:pPr>
             <w:r>
-              <w:t xml:space="preserve">6.8</w:t>
+              <w:t xml:space="preserve">11.4</w:t>
             </w:r>
           </w:p>
         </w:tc>
@@ -2251,7 +2251,7 @@
               <w:jc w:val="right"/>
             </w:pPr>
             <w:r>
-              <w:t xml:space="preserve">1106</w:t>
+              <w:t xml:space="preserve">1069</w:t>
             </w:r>
           </w:p>
         </w:tc>
@@ -2263,7 +2263,7 @@
               <w:jc w:val="right"/>
             </w:pPr>
             <w:r>
-              <w:t xml:space="preserve">304</w:t>
+              <w:t xml:space="preserve">196</w:t>
             </w:r>
           </w:p>
         </w:tc>
@@ -2275,7 +2275,7 @@
               <w:jc w:val="right"/>
             </w:pPr>
             <w:r>
-              <w:t xml:space="preserve">27.5</w:t>
+              <w:t xml:space="preserve">18.3</w:t>
             </w:r>
           </w:p>
         </w:tc>
@@ -2301,7 +2301,7 @@
               <w:jc w:val="right"/>
             </w:pPr>
             <w:r>
-              <w:t xml:space="preserve">818</w:t>
+              <w:t xml:space="preserve">845</w:t>
             </w:r>
           </w:p>
         </w:tc>
@@ -2313,7 +2313,7 @@
               <w:jc w:val="right"/>
             </w:pPr>
             <w:r>
-              <w:t xml:space="preserve">78</w:t>
+              <w:t xml:space="preserve">123</w:t>
             </w:r>
           </w:p>
         </w:tc>
@@ -2325,7 +2325,7 @@
               <w:jc w:val="right"/>
             </w:pPr>
             <w:r>
-              <w:t xml:space="preserve">9.5</w:t>
+              <w:t xml:space="preserve">14.6</w:t>
             </w:r>
           </w:p>
         </w:tc>
@@ -2351,7 +2351,7 @@
               <w:jc w:val="right"/>
             </w:pPr>
             <w:r>
-              <w:t xml:space="preserve">818</w:t>
+              <w:t xml:space="preserve">845</w:t>
             </w:r>
           </w:p>
         </w:tc>
@@ -2363,7 +2363,7 @@
               <w:jc w:val="right"/>
             </w:pPr>
             <w:r>
-              <w:t xml:space="preserve">43</w:t>
+              <w:t xml:space="preserve">58</w:t>
             </w:r>
           </w:p>
         </w:tc>
@@ -2375,7 +2375,7 @@
               <w:jc w:val="right"/>
             </w:pPr>
             <w:r>
-              <w:t xml:space="preserve">5.3</w:t>
+              <w:t xml:space="preserve">6.9</w:t>
             </w:r>
           </w:p>
         </w:tc>
@@ -2401,7 +2401,7 @@
               <w:jc w:val="right"/>
             </w:pPr>
             <w:r>
-              <w:t xml:space="preserve">818</w:t>
+              <w:t xml:space="preserve">845</w:t>
             </w:r>
           </w:p>
         </w:tc>
@@ -2413,7 +2413,7 @@
               <w:jc w:val="right"/>
             </w:pPr>
             <w:r>
-              <w:t xml:space="preserve">70</w:t>
+              <w:t xml:space="preserve">102</w:t>
             </w:r>
           </w:p>
         </w:tc>
@@ -2425,7 +2425,7 @@
               <w:jc w:val="right"/>
             </w:pPr>
             <w:r>
-              <w:t xml:space="preserve">8.6</w:t>
+              <w:t xml:space="preserve">12.1</w:t>
             </w:r>
           </w:p>
         </w:tc>
@@ -2451,7 +2451,7 @@
               <w:jc w:val="right"/>
             </w:pPr>
             <w:r>
-              <w:t xml:space="preserve">777</w:t>
+              <w:t xml:space="preserve">799</w:t>
             </w:r>
           </w:p>
         </w:tc>
@@ -2463,7 +2463,7 @@
               <w:jc w:val="right"/>
             </w:pPr>
             <w:r>
-              <w:t xml:space="preserve">68</w:t>
+              <w:t xml:space="preserve">103</w:t>
             </w:r>
           </w:p>
         </w:tc>
@@ -2475,7 +2475,7 @@
               <w:jc w:val="right"/>
             </w:pPr>
             <w:r>
-              <w:t xml:space="preserve">8.8</w:t>
+              <w:t xml:space="preserve">12.9</w:t>
             </w:r>
           </w:p>
         </w:tc>
@@ -2501,7 +2501,7 @@
               <w:jc w:val="right"/>
             </w:pPr>
             <w:r>
-              <w:t xml:space="preserve">725</w:t>
+              <w:t xml:space="preserve">729</w:t>
             </w:r>
           </w:p>
         </w:tc>
@@ -2513,7 +2513,7 @@
               <w:jc w:val="right"/>
             </w:pPr>
             <w:r>
-              <w:t xml:space="preserve">55</w:t>
+              <w:t xml:space="preserve">92</w:t>
             </w:r>
           </w:p>
         </w:tc>
@@ -2525,7 +2525,7 @@
               <w:jc w:val="right"/>
             </w:pPr>
             <w:r>
-              <w:t xml:space="preserve">7.6</w:t>
+              <w:t xml:space="preserve">12.6</w:t>
             </w:r>
           </w:p>
         </w:tc>
@@ -2627,19 +2627,19 @@
               <w:jc w:val="right"/>
             </w:pPr>
             <w:r>
-              <w:t xml:space="preserve">1.51</w:t>
-            </w:r>
-          </w:p>
-        </w:tc>
-        <w:tc>
-          <w:tcPr/>
-          <w:p>
-            <w:pPr>
-              <w:pStyle w:val="Compact"/>
-              <w:jc w:val="left"/>
-            </w:pPr>
-            <w:r>
-              <w:t xml:space="preserve">0.69-3.28</w:t>
+              <w:t xml:space="preserve">2.36</w:t>
+            </w:r>
+          </w:p>
+        </w:tc>
+        <w:tc>
+          <w:tcPr/>
+          <w:p>
+            <w:pPr>
+              <w:pStyle w:val="Compact"/>
+              <w:jc w:val="left"/>
+            </w:pPr>
+            <w:r>
+              <w:t xml:space="preserve">1.38-4.04</w:t>
             </w:r>
           </w:p>
         </w:tc>
@@ -2651,7 +2651,7 @@
               <w:jc w:val="right"/>
             </w:pPr>
             <w:r>
-              <w:t xml:space="preserve">0.303</w:t>
+              <w:t xml:space="preserve">0.002</w:t>
             </w:r>
           </w:p>
         </w:tc>
@@ -2677,19 +2677,19 @@
               <w:jc w:val="right"/>
             </w:pPr>
             <w:r>
-              <w:t xml:space="preserve">1.15</w:t>
-            </w:r>
-          </w:p>
-        </w:tc>
-        <w:tc>
-          <w:tcPr/>
-          <w:p>
-            <w:pPr>
-              <w:pStyle w:val="Compact"/>
-              <w:jc w:val="left"/>
-            </w:pPr>
-            <w:r>
-              <w:t xml:space="preserve">0.64-2.07</w:t>
+              <w:t xml:space="preserve">0.86</w:t>
+            </w:r>
+          </w:p>
+        </w:tc>
+        <w:tc>
+          <w:tcPr/>
+          <w:p>
+            <w:pPr>
+              <w:pStyle w:val="Compact"/>
+              <w:jc w:val="left"/>
+            </w:pPr>
+            <w:r>
+              <w:t xml:space="preserve">0.5-1.48</w:t>
             </w:r>
           </w:p>
         </w:tc>
@@ -2701,7 +2701,7 @@
               <w:jc w:val="right"/>
             </w:pPr>
             <w:r>
-              <w:t xml:space="preserve">0.637</w:t>
+              <w:t xml:space="preserve">0.589</w:t>
             </w:r>
           </w:p>
         </w:tc>
@@ -2727,19 +2727,19 @@
               <w:jc w:val="right"/>
             </w:pPr>
             <w:r>
-              <w:t xml:space="preserve">2.56</w:t>
-            </w:r>
-          </w:p>
-        </w:tc>
-        <w:tc>
-          <w:tcPr/>
-          <w:p>
-            <w:pPr>
-              <w:pStyle w:val="Compact"/>
-              <w:jc w:val="left"/>
-            </w:pPr>
-            <w:r>
-              <w:t xml:space="preserve">1.47-4.48</w:t>
+              <w:t xml:space="preserve">1.40</w:t>
+            </w:r>
+          </w:p>
+        </w:tc>
+        <w:tc>
+          <w:tcPr/>
+          <w:p>
+            <w:pPr>
+              <w:pStyle w:val="Compact"/>
+              <w:jc w:val="left"/>
+            </w:pPr>
+            <w:r>
+              <w:t xml:space="preserve">0.94-2.09</w:t>
             </w:r>
           </w:p>
         </w:tc>
@@ -2751,7 +2751,57 @@
               <w:jc w:val="right"/>
             </w:pPr>
             <w:r>
-              <w:t xml:space="preserve">0.001</w:t>
+              <w:t xml:space="preserve">0.099</w:t>
+            </w:r>
+          </w:p>
+        </w:tc>
+      </w:tr>
+      <w:tr>
+        <w:tc>
+          <w:tcPr/>
+          <w:p>
+            <w:pPr>
+              <w:pStyle w:val="Compact"/>
+              <w:jc w:val="left"/>
+            </w:pPr>
+            <w:r>
+              <w:t xml:space="preserve">n_authors</w:t>
+            </w:r>
+          </w:p>
+        </w:tc>
+        <w:tc>
+          <w:tcPr/>
+          <w:p>
+            <w:pPr>
+              <w:pStyle w:val="Compact"/>
+              <w:jc w:val="right"/>
+            </w:pPr>
+            <w:r>
+              <w:t xml:space="preserve">1.25</w:t>
+            </w:r>
+          </w:p>
+        </w:tc>
+        <w:tc>
+          <w:tcPr/>
+          <w:p>
+            <w:pPr>
+              <w:pStyle w:val="Compact"/>
+              <w:jc w:val="left"/>
+            </w:pPr>
+            <w:r>
+              <w:t xml:space="preserve">1.06-1.46</w:t>
+            </w:r>
+          </w:p>
+        </w:tc>
+        <w:tc>
+          <w:tcPr/>
+          <w:p>
+            <w:pPr>
+              <w:pStyle w:val="Compact"/>
+              <w:jc w:val="right"/>
+            </w:pPr>
+            <w:r>
+              <w:t xml:space="preserve">0.006</w:t>
             </w:r>
           </w:p>
         </w:tc>
@@ -2777,19 +2827,19 @@
               <w:jc w:val="right"/>
             </w:pPr>
             <w:r>
-              <w:t xml:space="preserve">2.38</w:t>
-            </w:r>
-          </w:p>
-        </w:tc>
-        <w:tc>
-          <w:tcPr/>
-          <w:p>
-            <w:pPr>
-              <w:pStyle w:val="Compact"/>
-              <w:jc w:val="left"/>
-            </w:pPr>
-            <w:r>
-              <w:t xml:space="preserve">0.95-5.96</w:t>
+              <w:t xml:space="preserve">1.76</w:t>
+            </w:r>
+          </w:p>
+        </w:tc>
+        <w:tc>
+          <w:tcPr/>
+          <w:p>
+            <w:pPr>
+              <w:pStyle w:val="Compact"/>
+              <w:jc w:val="left"/>
+            </w:pPr>
+            <w:r>
+              <w:t xml:space="preserve">0.82-3.8</w:t>
             </w:r>
           </w:p>
         </w:tc>
@@ -2801,7 +2851,7 @@
               <w:jc w:val="right"/>
             </w:pPr>
             <w:r>
-              <w:t xml:space="preserve">0.063</w:t>
+              <w:t xml:space="preserve">0.147</w:t>
             </w:r>
           </w:p>
         </w:tc>
@@ -2827,19 +2877,19 @@
               <w:jc w:val="right"/>
             </w:pPr>
             <w:r>
-              <w:t xml:space="preserve">5.20</w:t>
-            </w:r>
-          </w:p>
-        </w:tc>
-        <w:tc>
-          <w:tcPr/>
-          <w:p>
-            <w:pPr>
-              <w:pStyle w:val="Compact"/>
-              <w:jc w:val="left"/>
-            </w:pPr>
-            <w:r>
-              <w:t xml:space="preserve">0.71-38.23</w:t>
+              <w:t xml:space="preserve">3.00</w:t>
+            </w:r>
+          </w:p>
+        </w:tc>
+        <w:tc>
+          <w:tcPr/>
+          <w:p>
+            <w:pPr>
+              <w:pStyle w:val="Compact"/>
+              <w:jc w:val="left"/>
+            </w:pPr>
+            <w:r>
+              <w:t xml:space="preserve">0.41-21.75</w:t>
             </w:r>
           </w:p>
         </w:tc>
@@ -2851,7 +2901,7 @@
               <w:jc w:val="right"/>
             </w:pPr>
             <w:r>
-              <w:t xml:space="preserve">0.105</w:t>
+              <w:t xml:space="preserve">0.277</w:t>
             </w:r>
           </w:p>
         </w:tc>
@@ -2862,7 +2912,7 @@
         <w:pStyle w:val="BodyText"/>
       </w:pPr>
       <w:r>
-        <w:t xml:space="preserve">Proportional hazards assumption: global test p = 0.018.</w:t>
+        <w:t xml:space="preserve">Proportional hazards assumption: global test p = 0.414.</w:t>
       </w:r>
     </w:p>
     <w:bookmarkEnd w:id="32"/>
@@ -3844,19 +3894,19 @@
               <w:jc w:val="right"/>
             </w:pPr>
             <w:r>
-              <w:t xml:space="preserve">84</w:t>
-            </w:r>
-          </w:p>
-        </w:tc>
-        <w:tc>
-          <w:tcPr/>
-          <w:p>
-            <w:pPr>
-              <w:pStyle w:val="Compact"/>
-              <w:jc w:val="left"/>
-            </w:pPr>
-            <w:r>
-              <w:t xml:space="preserve">88.4%</w:t>
+              <w:t xml:space="preserve">0</w:t>
+            </w:r>
+          </w:p>
+        </w:tc>
+        <w:tc>
+          <w:tcPr/>
+          <w:p>
+            <w:pPr>
+              <w:pStyle w:val="Compact"/>
+              <w:jc w:val="left"/>
+            </w:pPr>
+            <w:r>
+              <w:t xml:space="preserve">0%</w:t>
             </w:r>
           </w:p>
         </w:tc>
@@ -3894,19 +3944,19 @@
               <w:jc w:val="right"/>
             </w:pPr>
             <w:r>
-              <w:t xml:space="preserve">86</w:t>
-            </w:r>
-          </w:p>
-        </w:tc>
-        <w:tc>
-          <w:tcPr/>
-          <w:p>
-            <w:pPr>
-              <w:pStyle w:val="Compact"/>
-              <w:jc w:val="left"/>
-            </w:pPr>
-            <w:r>
-              <w:t xml:space="preserve">89.6%</w:t>
+              <w:t xml:space="preserve">0</w:t>
+            </w:r>
+          </w:p>
+        </w:tc>
+        <w:tc>
+          <w:tcPr/>
+          <w:p>
+            <w:pPr>
+              <w:pStyle w:val="Compact"/>
+              <w:jc w:val="left"/>
+            </w:pPr>
+            <w:r>
+              <w:t xml:space="preserve">0%</w:t>
             </w:r>
           </w:p>
         </w:tc>
@@ -3944,19 +3994,19 @@
               <w:jc w:val="right"/>
             </w:pPr>
             <w:r>
-              <w:t xml:space="preserve">55</w:t>
-            </w:r>
-          </w:p>
-        </w:tc>
-        <w:tc>
-          <w:tcPr/>
-          <w:p>
-            <w:pPr>
-              <w:pStyle w:val="Compact"/>
-              <w:jc w:val="left"/>
-            </w:pPr>
-            <w:r>
-              <w:t xml:space="preserve">59.1%</w:t>
+              <w:t xml:space="preserve">0</w:t>
+            </w:r>
+          </w:p>
+        </w:tc>
+        <w:tc>
+          <w:tcPr/>
+          <w:p>
+            <w:pPr>
+              <w:pStyle w:val="Compact"/>
+              <w:jc w:val="left"/>
+            </w:pPr>
+            <w:r>
+              <w:t xml:space="preserve">0%</w:t>
             </w:r>
           </w:p>
         </w:tc>
@@ -3994,19 +4044,19 @@
               <w:jc w:val="right"/>
             </w:pPr>
             <w:r>
-              <w:t xml:space="preserve">79</w:t>
-            </w:r>
-          </w:p>
-        </w:tc>
-        <w:tc>
-          <w:tcPr/>
-          <w:p>
-            <w:pPr>
-              <w:pStyle w:val="Compact"/>
-              <w:jc w:val="left"/>
-            </w:pPr>
-            <w:r>
-              <w:t xml:space="preserve">83.2%</w:t>
+              <w:t xml:space="preserve">0</w:t>
+            </w:r>
+          </w:p>
+        </w:tc>
+        <w:tc>
+          <w:tcPr/>
+          <w:p>
+            <w:pPr>
+              <w:pStyle w:val="Compact"/>
+              <w:jc w:val="left"/>
+            </w:pPr>
+            <w:r>
+              <w:t xml:space="preserve">0%</w:t>
             </w:r>
           </w:p>
         </w:tc>
@@ -4044,19 +4094,19 @@
               <w:jc w:val="right"/>
             </w:pPr>
             <w:r>
-              <w:t xml:space="preserve">83</w:t>
-            </w:r>
-          </w:p>
-        </w:tc>
-        <w:tc>
-          <w:tcPr/>
-          <w:p>
-            <w:pPr>
-              <w:pStyle w:val="Compact"/>
-              <w:jc w:val="left"/>
-            </w:pPr>
-            <w:r>
-              <w:t xml:space="preserve">86.5%</w:t>
+              <w:t xml:space="preserve">0</w:t>
+            </w:r>
+          </w:p>
+        </w:tc>
+        <w:tc>
+          <w:tcPr/>
+          <w:p>
+            <w:pPr>
+              <w:pStyle w:val="Compact"/>
+              <w:jc w:val="left"/>
+            </w:pPr>
+            <w:r>
+              <w:t xml:space="preserve">0%</w:t>
             </w:r>
           </w:p>
         </w:tc>
@@ -4094,19 +4144,19 @@
               <w:jc w:val="right"/>
             </w:pPr>
             <w:r>
-              <w:t xml:space="preserve">1</w:t>
-            </w:r>
-          </w:p>
-        </w:tc>
-        <w:tc>
-          <w:tcPr/>
-          <w:p>
-            <w:pPr>
-              <w:pStyle w:val="Compact"/>
-              <w:jc w:val="left"/>
-            </w:pPr>
-            <w:r>
-              <w:t xml:space="preserve">1%</w:t>
+              <w:t xml:space="preserve">0</w:t>
+            </w:r>
+          </w:p>
+        </w:tc>
+        <w:tc>
+          <w:tcPr/>
+          <w:p>
+            <w:pPr>
+              <w:pStyle w:val="Compact"/>
+              <w:jc w:val="left"/>
+            </w:pPr>
+            <w:r>
+              <w:t xml:space="preserve">0%</w:t>
             </w:r>
           </w:p>
         </w:tc>
@@ -4144,19 +4194,19 @@
               <w:jc w:val="right"/>
             </w:pPr>
             <w:r>
-              <w:t xml:space="preserve">95</w:t>
-            </w:r>
-          </w:p>
-        </w:tc>
-        <w:tc>
-          <w:tcPr/>
-          <w:p>
-            <w:pPr>
-              <w:pStyle w:val="Compact"/>
-              <w:jc w:val="left"/>
-            </w:pPr>
-            <w:r>
-              <w:t xml:space="preserve">100%</w:t>
+              <w:t xml:space="preserve">0</w:t>
+            </w:r>
+          </w:p>
+        </w:tc>
+        <w:tc>
+          <w:tcPr/>
+          <w:p>
+            <w:pPr>
+              <w:pStyle w:val="Compact"/>
+              <w:jc w:val="left"/>
+            </w:pPr>
+            <w:r>
+              <w:t xml:space="preserve">0%</w:t>
             </w:r>
           </w:p>
         </w:tc>
@@ -4611,7 +4661,7 @@
         <w:t xml:space="preserve">output/abstracts_with_matches.csv</w:t>
       </w:r>
       <w:r>
-        <w:t xml:space="preserve">) contains 45 columns per abstract:</w:t>
+        <w:t xml:space="preserve">) contains 62 columns per abstract:</w:t>
       </w:r>
     </w:p>
     <w:tbl>
@@ -5132,6 +5182,1001 @@
     </w:p>
     <w:bookmarkEnd w:id="41"/>
     <w:bookmarkEnd w:id="42"/>
+    <w:bookmarkStart w:id="53" w:name="a10.-npi-identity-resolution"/>
+    <w:p>
+      <w:pPr>
+        <w:pStyle w:val="Heading2"/>
+      </w:pPr>
+      <w:r>
+        <w:t xml:space="preserve">A10. NPI Identity Resolution</w:t>
+      </w:r>
+    </w:p>
+    <w:bookmarkStart w:id="43" w:name="a10.1-overview"/>
+    <w:p>
+      <w:pPr>
+        <w:pStyle w:val="Heading3"/>
+      </w:pPr>
+      <w:r>
+        <w:t xml:space="preserve">A10.1 Overview</w:t>
+      </w:r>
+    </w:p>
+    <w:p>
+      <w:pPr>
+        <w:pStyle w:val="FirstParagraph"/>
+      </w:pPr>
+      <w:r>
+        <w:t xml:space="preserve">To obtain physician-level demographics independent of the abstract-to-publication matching pipeline, first authors with US-based affiliations were linked to National Provider Identifiers (NPIs) using a probabilistic identity resolution approach. This linkage provides NPI-verified gender, practice state, and subspecialty certification for each matched author, bypassing the limitation that PubMed-derived demographics are only available for confirmed publication matches.</w:t>
+      </w:r>
+    </w:p>
+    <w:bookmarkEnd w:id="43"/>
+    <w:bookmarkStart w:id="44" w:name="a10.2-candidate-pool"/>
+    <w:p>
+      <w:pPr>
+        <w:pStyle w:val="Heading3"/>
+      </w:pPr>
+      <w:r>
+        <w:t xml:space="preserve">A10.2 Candidate Pool</w:t>
+      </w:r>
+    </w:p>
+    <w:p>
+      <w:pPr>
+        <w:pStyle w:val="FirstParagraph"/>
+      </w:pPr>
+      <w:r>
+        <w:t xml:space="preserve">Rather than searching the full NPPES registry (2.1 million providers, 213,000 with OB/GYN taxonomy codes), candidates were drawn from the isochrones project’s canonical ABOG-NPI dataset: 60,846 board-certified obstetrician-gynecologists with validated NPI linkages, full names, practice states, gender, and ABOG subspecialty certifications (Generalist, MIG [minimally invasive gynecology], Female Pelvic Medicine &amp; Reconstructive Surgery, Gynecologic Oncology, Maternal-Fetal Medicine, Reproductive Endocrinology and Infertility, Complex Family Planning, and others). This smaller, more relevant pool dramatically reduced name collisions compared to raw NPPES queries.</w:t>
+      </w:r>
+    </w:p>
+    <w:bookmarkEnd w:id="44"/>
+    <w:bookmarkStart w:id="45" w:name="a10.3-name-parsing"/>
+    <w:p>
+      <w:pPr>
+        <w:pStyle w:val="Heading3"/>
+      </w:pPr>
+      <w:r>
+        <w:t xml:space="preserve">A10.3 Name Parsing</w:t>
+      </w:r>
+    </w:p>
+    <w:p>
+      <w:pPr>
+        <w:pStyle w:val="FirstParagraph"/>
+      </w:pPr>
+      <w:r>
+        <w:t xml:space="preserve">Author names from the AAGL abstract listings (e.g.,</w:t>
+      </w:r>
+      <w:r>
+        <w:t xml:space="preserve"> </w:t>
+      </w:r>
+      <w:r>
+        <w:t xml:space="preserve">“R.S. Guido”</w:t>
+      </w:r>
+      <w:r>
+        <w:t xml:space="preserve">,</w:t>
+      </w:r>
+      <w:r>
+        <w:t xml:space="preserve"> </w:t>
+      </w:r>
+      <w:r>
+        <w:t xml:space="preserve">“E. Chapman-Davis”</w:t>
+      </w:r>
+      <w:r>
+        <w:t xml:space="preserve">,</w:t>
+      </w:r>
+      <w:r>
+        <w:t xml:space="preserve"> </w:t>
+      </w:r>
+      <w:r>
+        <w:t xml:space="preserve">“J.P.M. Penninx”</w:t>
+      </w:r>
+      <w:r>
+        <w:t xml:space="preserve">) were parsed using the</w:t>
+      </w:r>
+      <w:r>
+        <w:t xml:space="preserve"> </w:t>
+      </w:r>
+      <w:r>
+        <w:rPr>
+          <w:rStyle w:val="VerbatimChar"/>
+        </w:rPr>
+        <w:t xml:space="preserve">humaniformat</w:t>
+      </w:r>
+      <w:r>
+        <w:t xml:space="preserve"> </w:t>
+      </w:r>
+      <w:r>
+        <w:t xml:space="preserve">R package, which correctly handles compound surnames (El Hachem, Chapman-Davis, St. Louis), multi-initial first names, and suffixes. A fallback to regex-based normalization was applied for edge cases. For the 129 confirmed-match abstracts where the PubMed first author’s last name matched the AAGL first author’s last name, the full PubMed first name was used instead of the initial.</w:t>
+      </w:r>
+    </w:p>
+    <w:bookmarkEnd w:id="45"/>
+    <w:bookmarkStart w:id="46" w:name="a10.4-matching-strategies"/>
+    <w:p>
+      <w:pPr>
+        <w:pStyle w:val="Heading3"/>
+      </w:pPr>
+      <w:r>
+        <w:t xml:space="preserve">A10.4 Matching Strategies</w:t>
+      </w:r>
+    </w:p>
+    <w:p>
+      <w:pPr>
+        <w:pStyle w:val="FirstParagraph"/>
+      </w:pPr>
+      <w:r>
+        <w:t xml:space="preserve">Two strategies were applied sequentially:</w:t>
+      </w:r>
+    </w:p>
+    <w:p>
+      <w:pPr>
+        <w:pStyle w:val="BodyText"/>
+      </w:pPr>
+      <w:r>
+        <w:rPr>
+          <w:b/>
+          <w:bCs/>
+        </w:rPr>
+        <w:t xml:space="preserve">Strategy A (exact full name):</w:t>
+      </w:r>
+      <w:r>
+        <w:t xml:space="preserve"> </w:t>
+      </w:r>
+      <w:r>
+        <w:t xml:space="preserve">For authors with full first names (from confirmed PubMed matches where names agreed), the ABOG pool was searched by exact first name and last name. Base confidence: 0.95.</w:t>
+      </w:r>
+    </w:p>
+    <w:p>
+      <w:pPr>
+        <w:pStyle w:val="BodyText"/>
+      </w:pPr>
+      <w:r>
+        <w:rPr>
+          <w:b/>
+          <w:bCs/>
+        </w:rPr>
+        <w:t xml:space="preserve">Strategy B (initial + last name):</w:t>
+      </w:r>
+      <w:r>
+        <w:t xml:space="preserve"> </w:t>
+      </w:r>
+      <w:r>
+        <w:t xml:space="preserve">For the remaining authors with initials only, the pool was searched by last name and first initial. Base confidence: 0.70.</w:t>
+      </w:r>
+    </w:p>
+    <w:p>
+      <w:pPr>
+        <w:pStyle w:val="BodyText"/>
+      </w:pPr>
+      <w:r>
+        <w:t xml:space="preserve">A fuzzy last-name fallback was applied when exact matching returned no candidates: hyphens and spaces were stripped from both the query and pool names (e.g.,</w:t>
+      </w:r>
+      <w:r>
+        <w:t xml:space="preserve"> </w:t>
+      </w:r>
+      <w:r>
+        <w:t xml:space="preserve">“CHAPMANDAVIS”</w:t>
+      </w:r>
+      <w:r>
+        <w:t xml:space="preserve"> </w:t>
+      </w:r>
+      <w:r>
+        <w:t xml:space="preserve">matching</w:t>
+      </w:r>
+      <w:r>
+        <w:t xml:space="preserve"> </w:t>
+      </w:r>
+      <w:r>
+        <w:t xml:space="preserve">“CHAPMAN-DAVIS”</w:t>
+      </w:r>
+      <w:r>
+        <w:t xml:space="preserve">), recovering compound-name mismatches.</w:t>
+      </w:r>
+    </w:p>
+    <w:bookmarkEnd w:id="46"/>
+    <w:bookmarkStart w:id="47" w:name="a10.5-scoring"/>
+    <w:p>
+      <w:pPr>
+        <w:pStyle w:val="Heading3"/>
+      </w:pPr>
+      <w:r>
+        <w:t xml:space="preserve">A10.5 Scoring</w:t>
+      </w:r>
+    </w:p>
+    <w:p>
+      <w:pPr>
+        <w:pStyle w:val="TableCaption"/>
+      </w:pPr>
+      <w:r>
+        <w:t xml:space="preserve">NPI matching composite scoring system</w:t>
+      </w:r>
+    </w:p>
+    <w:tbl>
+      <w:tblPr>
+        <w:tblStyle w:val="Table"/>
+        <w:tblW w:type="auto" w:w="0"/>
+        <w:tblLook w:firstRow="1" w:lastRow="0" w:firstColumn="0" w:lastColumn="0" w:noHBand="0" w:noVBand="0" w:val="0020"/>
+        <w:tblCaption w:val="NPI matching composite scoring system"/>
+      </w:tblPr>
+      <w:tblGrid>
+        <w:gridCol w:w="3960"/>
+        <w:gridCol w:w="3960"/>
+      </w:tblGrid>
+      <w:tr>
+        <w:trPr>
+          <w:tblHeader w:val="on"/>
+        </w:trPr>
+        <w:tc>
+          <w:tcPr/>
+          <w:p>
+            <w:pPr>
+              <w:pStyle w:val="Compact"/>
+              <w:jc w:val="left"/>
+            </w:pPr>
+            <w:r>
+              <w:t xml:space="preserve">Feature</w:t>
+            </w:r>
+          </w:p>
+        </w:tc>
+        <w:tc>
+          <w:tcPr/>
+          <w:p>
+            <w:pPr>
+              <w:pStyle w:val="Compact"/>
+              <w:jc w:val="left"/>
+            </w:pPr>
+            <w:r>
+              <w:t xml:space="preserve">Points</w:t>
+            </w:r>
+          </w:p>
+        </w:tc>
+      </w:tr>
+      <w:tr>
+        <w:tc>
+          <w:tcPr/>
+          <w:p>
+            <w:pPr>
+              <w:pStyle w:val="Compact"/>
+              <w:jc w:val="left"/>
+            </w:pPr>
+            <w:r>
+              <w:t xml:space="preserve">Exact first + last name match</w:t>
+            </w:r>
+          </w:p>
+        </w:tc>
+        <w:tc>
+          <w:tcPr/>
+          <w:p>
+            <w:pPr>
+              <w:pStyle w:val="Compact"/>
+              <w:jc w:val="left"/>
+            </w:pPr>
+            <w:r>
+              <w:t xml:space="preserve">+50</w:t>
+            </w:r>
+          </w:p>
+        </w:tc>
+      </w:tr>
+      <w:tr>
+        <w:tc>
+          <w:tcPr/>
+          <w:p>
+            <w:pPr>
+              <w:pStyle w:val="Compact"/>
+              <w:jc w:val="left"/>
+            </w:pPr>
+            <w:r>
+              <w:t xml:space="preserve">Initial + last name match</w:t>
+            </w:r>
+          </w:p>
+        </w:tc>
+        <w:tc>
+          <w:tcPr/>
+          <w:p>
+            <w:pPr>
+              <w:pStyle w:val="Compact"/>
+              <w:jc w:val="left"/>
+            </w:pPr>
+            <w:r>
+              <w:t xml:space="preserve">+15</w:t>
+            </w:r>
+          </w:p>
+        </w:tc>
+      </w:tr>
+      <w:tr>
+        <w:tc>
+          <w:tcPr/>
+          <w:p>
+            <w:pPr>
+              <w:pStyle w:val="Compact"/>
+              <w:jc w:val="left"/>
+            </w:pPr>
+            <w:r>
+              <w:t xml:space="preserve">Affiliation state = NPI practice state</w:t>
+            </w:r>
+          </w:p>
+        </w:tc>
+        <w:tc>
+          <w:tcPr/>
+          <w:p>
+            <w:pPr>
+              <w:pStyle w:val="Compact"/>
+              <w:jc w:val="left"/>
+            </w:pPr>
+            <w:r>
+              <w:t xml:space="preserve">+20</w:t>
+            </w:r>
+          </w:p>
+        </w:tc>
+      </w:tr>
+      <w:tr>
+        <w:tc>
+          <w:tcPr/>
+          <w:p>
+            <w:pPr>
+              <w:pStyle w:val="Compact"/>
+              <w:jc w:val="left"/>
+            </w:pPr>
+            <w:r>
+              <w:t xml:space="preserve">Gender agreement</w:t>
+            </w:r>
+          </w:p>
+        </w:tc>
+        <w:tc>
+          <w:tcPr/>
+          <w:p>
+            <w:pPr>
+              <w:pStyle w:val="Compact"/>
+              <w:jc w:val="left"/>
+            </w:pPr>
+            <w:r>
+              <w:t xml:space="preserve">+10</w:t>
+            </w:r>
+          </w:p>
+        </w:tc>
+      </w:tr>
+      <w:tr>
+        <w:tc>
+          <w:tcPr/>
+          <w:p>
+            <w:pPr>
+              <w:pStyle w:val="Compact"/>
+              <w:jc w:val="left"/>
+            </w:pPr>
+            <w:r>
+              <w:t xml:space="preserve">MIG (MIGS) subspecialty</w:t>
+            </w:r>
+          </w:p>
+        </w:tc>
+        <w:tc>
+          <w:tcPr/>
+          <w:p>
+            <w:pPr>
+              <w:pStyle w:val="Compact"/>
+              <w:jc w:val="left"/>
+            </w:pPr>
+            <w:r>
+              <w:t xml:space="preserve">+25</w:t>
+            </w:r>
+          </w:p>
+        </w:tc>
+      </w:tr>
+      <w:tr>
+        <w:tc>
+          <w:tcPr/>
+          <w:p>
+            <w:pPr>
+              <w:pStyle w:val="Compact"/>
+              <w:jc w:val="left"/>
+            </w:pPr>
+            <w:r>
+              <w:t xml:space="preserve">FPMRS + pelvic floor procedure</w:t>
+            </w:r>
+          </w:p>
+        </w:tc>
+        <w:tc>
+          <w:tcPr/>
+          <w:p>
+            <w:pPr>
+              <w:pStyle w:val="Compact"/>
+              <w:jc w:val="left"/>
+            </w:pPr>
+            <w:r>
+              <w:t xml:space="preserve">+15</w:t>
+            </w:r>
+          </w:p>
+        </w:tc>
+      </w:tr>
+      <w:tr>
+        <w:tc>
+          <w:tcPr/>
+          <w:p>
+            <w:pPr>
+              <w:pStyle w:val="Compact"/>
+              <w:jc w:val="left"/>
+            </w:pPr>
+            <w:r>
+              <w:t xml:space="preserve">GYN_ONC + oncology procedure</w:t>
+            </w:r>
+          </w:p>
+        </w:tc>
+        <w:tc>
+          <w:tcPr/>
+          <w:p>
+            <w:pPr>
+              <w:pStyle w:val="Compact"/>
+              <w:jc w:val="left"/>
+            </w:pPr>
+            <w:r>
+              <w:t xml:space="preserve">+15</w:t>
+            </w:r>
+          </w:p>
+        </w:tc>
+      </w:tr>
+      <w:tr>
+        <w:tc>
+          <w:tcPr/>
+          <w:p>
+            <w:pPr>
+              <w:pStyle w:val="Compact"/>
+              <w:jc w:val="left"/>
+            </w:pPr>
+            <w:r>
+              <w:t xml:space="preserve">REI + ectopic pregnancy procedure</w:t>
+            </w:r>
+          </w:p>
+        </w:tc>
+        <w:tc>
+          <w:tcPr/>
+          <w:p>
+            <w:pPr>
+              <w:pStyle w:val="Compact"/>
+              <w:jc w:val="left"/>
+            </w:pPr>
+            <w:r>
+              <w:t xml:space="preserve">+10</w:t>
+            </w:r>
+          </w:p>
+        </w:tc>
+      </w:tr>
+      <w:tr>
+        <w:tc>
+          <w:tcPr/>
+          <w:p>
+            <w:pPr>
+              <w:pStyle w:val="Compact"/>
+              <w:jc w:val="left"/>
+            </w:pPr>
+            <w:r>
+              <w:t xml:space="preserve">Rare name (&lt;=3 in ABOG OB/GYN pool)</w:t>
+            </w:r>
+          </w:p>
+        </w:tc>
+        <w:tc>
+          <w:tcPr/>
+          <w:p>
+            <w:pPr>
+              <w:pStyle w:val="Compact"/>
+              <w:jc w:val="left"/>
+            </w:pPr>
+            <w:r>
+              <w:t xml:space="preserve">+10</w:t>
+            </w:r>
+          </w:p>
+        </w:tc>
+      </w:tr>
+    </w:tbl>
+    <w:p>
+      <w:pPr>
+        <w:pStyle w:val="BodyText"/>
+      </w:pPr>
+      <w:r>
+        <w:t xml:space="preserve">The MIGS subspecialty bonus (+25 points) reflects the strong prior that presenters at the AAGL Global Congress — the premier minimally invasive gynecology meeting — are disproportionately likely to hold MIG certification. Subspecialty-procedure concordance bonuses (FPMRS for pelvic floor abstracts, GYN_ONC for oncology abstracts) provided additional tiebreaking signal.</w:t>
+      </w:r>
+    </w:p>
+    <w:bookmarkEnd w:id="47"/>
+    <w:bookmarkStart w:id="48" w:name="a10.6-classification-tiers"/>
+    <w:p>
+      <w:pPr>
+        <w:pStyle w:val="Heading3"/>
+      </w:pPr>
+      <w:r>
+        <w:t xml:space="preserve">A10.6 Classification Tiers</w:t>
+      </w:r>
+    </w:p>
+    <w:p>
+      <w:pPr>
+        <w:pStyle w:val="TableCaption"/>
+      </w:pPr>
+      <w:r>
+        <w:t xml:space="preserve">NPI match classification tiers</w:t>
+      </w:r>
+    </w:p>
+    <w:tbl>
+      <w:tblPr>
+        <w:tblStyle w:val="Table"/>
+        <w:tblW w:type="pct" w:w="5000"/>
+        <w:tblLayout w:type="fixed"/>
+        <w:tblLook w:firstRow="1" w:lastRow="0" w:firstColumn="0" w:lastColumn="0" w:noHBand="0" w:noVBand="0" w:val="0020"/>
+        <w:tblCaption w:val="NPI match classification tiers"/>
+      </w:tblPr>
+      <w:tblGrid>
+        <w:gridCol w:w="1808"/>
+        <w:gridCol w:w="5363"/>
+        <w:gridCol w:w="748"/>
+      </w:tblGrid>
+      <w:tr>
+        <w:trPr>
+          <w:tblHeader w:val="on"/>
+        </w:trPr>
+        <w:tc>
+          <w:tcPr/>
+          <w:p>
+            <w:pPr>
+              <w:pStyle w:val="Compact"/>
+              <w:jc w:val="left"/>
+            </w:pPr>
+            <w:r>
+              <w:t xml:space="preserve">Tier</w:t>
+            </w:r>
+          </w:p>
+        </w:tc>
+        <w:tc>
+          <w:tcPr/>
+          <w:p>
+            <w:pPr>
+              <w:pStyle w:val="Compact"/>
+              <w:jc w:val="left"/>
+            </w:pPr>
+            <w:r>
+              <w:t xml:space="preserve">Criteria</w:t>
+            </w:r>
+          </w:p>
+        </w:tc>
+        <w:tc>
+          <w:tcPr/>
+          <w:p>
+            <w:pPr>
+              <w:pStyle w:val="Compact"/>
+              <w:jc w:val="left"/>
+            </w:pPr>
+            <w:r>
+              <w:t xml:space="preserve">Action</w:t>
+            </w:r>
+          </w:p>
+        </w:tc>
+      </w:tr>
+      <w:tr>
+        <w:tc>
+          <w:tcPr/>
+          <w:p>
+            <w:pPr>
+              <w:pStyle w:val="Compact"/>
+              <w:jc w:val="left"/>
+            </w:pPr>
+            <w:r>
+              <w:t xml:space="preserve">A: High confidence</w:t>
+            </w:r>
+          </w:p>
+        </w:tc>
+        <w:tc>
+          <w:tcPr/>
+          <w:p>
+            <w:pPr>
+              <w:pStyle w:val="Compact"/>
+              <w:jc w:val="left"/>
+            </w:pPr>
+            <w:r>
+              <w:t xml:space="preserve">Score &gt;= 50 AND unique top candidate (gap &gt;= 10 to second)</w:t>
+            </w:r>
+          </w:p>
+        </w:tc>
+        <w:tc>
+          <w:tcPr/>
+          <w:p>
+            <w:pPr>
+              <w:pStyle w:val="Compact"/>
+              <w:jc w:val="left"/>
+            </w:pPr>
+            <w:r>
+              <w:t xml:space="preserve">Auto-accept</w:t>
+            </w:r>
+          </w:p>
+        </w:tc>
+      </w:tr>
+      <w:tr>
+        <w:tc>
+          <w:tcPr/>
+          <w:p>
+            <w:pPr>
+              <w:pStyle w:val="Compact"/>
+              <w:jc w:val="left"/>
+            </w:pPr>
+            <w:r>
+              <w:t xml:space="preserve">A: High confidence (relaxed)</w:t>
+            </w:r>
+          </w:p>
+        </w:tc>
+        <w:tc>
+          <w:tcPr/>
+          <w:p>
+            <w:pPr>
+              <w:pStyle w:val="Compact"/>
+              <w:jc w:val="left"/>
+            </w:pPr>
+            <w:r>
+              <w:t xml:space="preserve">Score &gt;= 35 AND exactly 1 candidate in entire ABOG pool (single-candidate relaxation)</w:t>
+            </w:r>
+          </w:p>
+        </w:tc>
+        <w:tc>
+          <w:tcPr/>
+          <w:p>
+            <w:pPr>
+              <w:pStyle w:val="Compact"/>
+              <w:jc w:val="left"/>
+            </w:pPr>
+            <w:r>
+              <w:t xml:space="preserve">Auto-accept</w:t>
+            </w:r>
+          </w:p>
+        </w:tc>
+      </w:tr>
+      <w:tr>
+        <w:tc>
+          <w:tcPr/>
+          <w:p>
+            <w:pPr>
+              <w:pStyle w:val="Compact"/>
+              <w:jc w:val="left"/>
+            </w:pPr>
+            <w:r>
+              <w:t xml:space="preserve">B: Ambiguous</w:t>
+            </w:r>
+          </w:p>
+        </w:tc>
+        <w:tc>
+          <w:tcPr/>
+          <w:p>
+            <w:pPr>
+              <w:pStyle w:val="Compact"/>
+              <w:jc w:val="left"/>
+            </w:pPr>
+            <w:r>
+              <w:t xml:space="preserve">Score 30-49 OR multiple candidates within 10 points</w:t>
+            </w:r>
+          </w:p>
+        </w:tc>
+        <w:tc>
+          <w:tcPr/>
+          <w:p>
+            <w:pPr>
+              <w:pStyle w:val="Compact"/>
+              <w:jc w:val="left"/>
+            </w:pPr>
+            <w:r>
+              <w:t xml:space="preserve">Withheld</w:t>
+            </w:r>
+          </w:p>
+        </w:tc>
+      </w:tr>
+      <w:tr>
+        <w:tc>
+          <w:tcPr/>
+          <w:p>
+            <w:pPr>
+              <w:pStyle w:val="Compact"/>
+              <w:jc w:val="left"/>
+            </w:pPr>
+            <w:r>
+              <w:t xml:space="preserve">C: No match</w:t>
+            </w:r>
+          </w:p>
+        </w:tc>
+        <w:tc>
+          <w:tcPr/>
+          <w:p>
+            <w:pPr>
+              <w:pStyle w:val="Compact"/>
+              <w:jc w:val="left"/>
+            </w:pPr>
+            <w:r>
+              <w:t xml:space="preserve">Score &lt; 30 OR no candidates after filtering</w:t>
+            </w:r>
+          </w:p>
+        </w:tc>
+        <w:tc>
+          <w:tcPr/>
+          <w:p>
+            <w:pPr>
+              <w:pStyle w:val="Compact"/>
+              <w:jc w:val="left"/>
+            </w:pPr>
+            <w:r>
+              <w:t xml:space="preserve">Unmatched</w:t>
+            </w:r>
+          </w:p>
+        </w:tc>
+      </w:tr>
+    </w:tbl>
+    <w:bookmarkEnd w:id="48"/>
+    <w:bookmarkStart w:id="49" w:name="a10.7-single-candidate-relaxation-rule"/>
+    <w:p>
+      <w:pPr>
+        <w:pStyle w:val="Heading3"/>
+      </w:pPr>
+      <w:r>
+        <w:t xml:space="preserve">A10.7 Single-Candidate Relaxation Rule</w:t>
+      </w:r>
+    </w:p>
+    <w:p>
+      <w:pPr>
+        <w:pStyle w:val="FirstParagraph"/>
+      </w:pPr>
+      <w:r>
+        <w:t xml:space="preserve">The standard Tier A threshold requires a composite score of at least 50 points with a 10-point gap to the second-best candidate. For authors matched by initial + last name (base score 15), reaching 50 points requires strong corroborating signals (state match + gender match + rare name or MIGS subspecialty). This threshold is appropriate when multiple candidates exist and disambiguation is needed.</w:t>
+      </w:r>
+    </w:p>
+    <w:p>
+      <w:pPr>
+        <w:pStyle w:val="BodyText"/>
+      </w:pPr>
+      <w:r>
+        <w:t xml:space="preserve">However, when the ABOG pool contains exactly one board-certified OB/GYN with a given last name and first initial, the probability of a false match is inherently low regardless of corroborating signals. In such cases, the threshold was relaxed to 35 points. The rationale:</w:t>
+      </w:r>
+    </w:p>
+    <w:p>
+      <w:pPr>
+        <w:numPr>
+          <w:ilvl w:val="0"/>
+          <w:numId w:val="1005"/>
+        </w:numPr>
+      </w:pPr>
+      <w:r>
+        <w:rPr>
+          <w:b/>
+          <w:bCs/>
+        </w:rPr>
+        <w:t xml:space="preserve">Base rate argument.</w:t>
+      </w:r>
+      <w:r>
+        <w:t xml:space="preserve"> </w:t>
+      </w:r>
+      <w:r>
+        <w:t xml:space="preserve">The ABOG pool contains 60,846 physicians. For a unique (last name, first initial) combination to have exactly one entry, the name must be uncommon among US OB/GYNs. The prior probability that a sole-match candidate is the correct person is high.</w:t>
+      </w:r>
+    </w:p>
+    <w:p>
+      <w:pPr>
+        <w:numPr>
+          <w:ilvl w:val="0"/>
+          <w:numId w:val="1005"/>
+        </w:numPr>
+      </w:pPr>
+      <w:r>
+        <w:rPr>
+          <w:b/>
+          <w:bCs/>
+        </w:rPr>
+        <w:t xml:space="preserve">No disambiguation needed.</w:t>
+      </w:r>
+      <w:r>
+        <w:t xml:space="preserve"> </w:t>
+      </w:r>
+      <w:r>
+        <w:t xml:space="preserve">The gap-to-second criterion exists to prevent ambiguous assignments when multiple candidates score similarly. With only one candidate, this criterion is vacuous — there is no competing match to distinguish from.</w:t>
+      </w:r>
+    </w:p>
+    <w:p>
+      <w:pPr>
+        <w:numPr>
+          <w:ilvl w:val="0"/>
+          <w:numId w:val="1005"/>
+        </w:numPr>
+      </w:pPr>
+      <w:r>
+        <w:rPr>
+          <w:b/>
+          <w:bCs/>
+        </w:rPr>
+        <w:t xml:space="preserve">Minimum score guard.</w:t>
+      </w:r>
+      <w:r>
+        <w:t xml:space="preserve"> </w:t>
+      </w:r>
+      <w:r>
+        <w:t xml:space="preserve">The 35-point floor ensures that at least the initial match (+15) plus one corroborating signal (e.g., career plausibility +5 and rare name +10, or state match +20) must be present. Pure initial-only matches without any supporting evidence (score 15) are not accepted.</w:t>
+      </w:r>
+    </w:p>
+    <w:p>
+      <w:pPr>
+        <w:pStyle w:val="SourceCode"/>
+      </w:pPr>
+      <w:r>
+        <w:rPr>
+          <w:rStyle w:val="VerbatimChar"/>
+        </w:rPr>
+        <w:t xml:space="preserve">## Of 214 Tier A matches, 106 (50%) met the standard threshold (score &gt;= 50) and 108 (50%) were accepted via single-candidate relaxation (score 35-49, sole candidate).</w:t>
+      </w:r>
+    </w:p>
+    <w:bookmarkEnd w:id="49"/>
+    <w:bookmarkStart w:id="50" w:name="a10.8-one-to-one-enforcement"/>
+    <w:p>
+      <w:pPr>
+        <w:pStyle w:val="Heading3"/>
+      </w:pPr>
+      <w:r>
+        <w:t xml:space="preserve">A10.8 One-to-One Enforcement</w:t>
+      </w:r>
+    </w:p>
+    <w:p>
+      <w:pPr>
+        <w:pStyle w:val="FirstParagraph"/>
+      </w:pPr>
+      <w:r>
+        <w:t xml:space="preserve">After scoring, a greedy one-to-one assignment was enforced: if multiple abstracts claimed the same NPI, only the highest-scoring assignment was retained; lower-scoring claimants were demoted to Tier B (ambiguous). This prevents a single prolific physician from being</w:t>
+      </w:r>
+      <w:r>
+        <w:t xml:space="preserve"> </w:t>
+      </w:r>
+      <w:r>
+        <w:t xml:space="preserve">“consumed”</w:t>
+      </w:r>
+      <w:r>
+        <w:t xml:space="preserve"> </w:t>
+      </w:r>
+      <w:r>
+        <w:t xml:space="preserve">by an earlier, weaker match.</w:t>
+      </w:r>
+    </w:p>
+    <w:bookmarkEnd w:id="50"/>
+    <w:bookmarkStart w:id="51" w:name="a10.9-results"/>
+    <w:p>
+      <w:pPr>
+        <w:pStyle w:val="Heading3"/>
+      </w:pPr>
+      <w:r>
+        <w:t xml:space="preserve">A10.9 Results</w:t>
+      </w:r>
+    </w:p>
+    <w:p>
+      <w:pPr>
+        <w:pStyle w:val="SourceCode"/>
+      </w:pPr>
+      <w:r>
+        <w:rPr>
+          <w:rStyle w:val="VerbatimChar"/>
+        </w:rPr>
+        <w:t xml:space="preserve">## </w:t>
+      </w:r>
+      <w:r>
+        <w:br/>
+      </w:r>
+      <w:r>
+        <w:rPr>
+          <w:rStyle w:val="VerbatimChar"/>
+        </w:rPr>
+        <w:t xml:space="preserve">## </w:t>
+      </w:r>
+      <w:r>
+        <w:br/>
+      </w:r>
+      <w:r>
+        <w:rPr>
+          <w:rStyle w:val="VerbatimChar"/>
+        </w:rPr>
+        <w:t xml:space="preserve">## Of 214 Tier A matches, 56 (26%) held MIG (minimally invasive gynecology) subspecialty certification.</w:t>
+      </w:r>
+    </w:p>
+    <w:bookmarkEnd w:id="51"/>
+    <w:bookmarkStart w:id="52" w:name="a10.10-limitations"/>
+    <w:p>
+      <w:pPr>
+        <w:pStyle w:val="Heading3"/>
+      </w:pPr>
+      <w:r>
+        <w:t xml:space="preserve">A10.10 Limitations</w:t>
+      </w:r>
+    </w:p>
+    <w:p>
+      <w:pPr>
+        <w:pStyle w:val="FirstParagraph"/>
+      </w:pPr>
+      <w:r>
+        <w:t xml:space="preserve">The NPI matching approach has several inherent limitations:</w:t>
+      </w:r>
+    </w:p>
+    <w:p>
+      <w:pPr>
+        <w:numPr>
+          <w:ilvl w:val="0"/>
+          <w:numId w:val="1006"/>
+        </w:numPr>
+      </w:pPr>
+      <w:r>
+        <w:rPr>
+          <w:b/>
+          <w:bCs/>
+        </w:rPr>
+        <w:t xml:space="preserve">Initial-only names.</w:t>
+      </w:r>
+      <w:r>
+        <w:t xml:space="preserve"> </w:t>
+      </w:r>
+      <w:r>
+        <w:t xml:space="preserve">The AAGL abstract listing provides only first initials for most authors (e.g.,</w:t>
+      </w:r>
+      <w:r>
+        <w:t xml:space="preserve"> </w:t>
+      </w:r>
+      <w:r>
+        <w:t xml:space="preserve">“J. Smith”</w:t>
+      </w:r>
+      <w:r>
+        <w:t xml:space="preserve">). This prevents exact first-name matching for 559 of 689 US-based authors and increases ambiguity for common surnames.</w:t>
+      </w:r>
+    </w:p>
+    <w:p>
+      <w:pPr>
+        <w:numPr>
+          <w:ilvl w:val="0"/>
+          <w:numId w:val="1006"/>
+        </w:numPr>
+      </w:pPr>
+      <w:r>
+        <w:rPr>
+          <w:b/>
+          <w:bCs/>
+        </w:rPr>
+        <w:t xml:space="preserve">ABOG pool scope.</w:t>
+      </w:r>
+      <w:r>
+        <w:t xml:space="preserve"> </w:t>
+      </w:r>
+      <w:r>
+        <w:t xml:space="preserve">The candidate pool includes only ABOG board-certified physicians. Presenters who are residents, fellows, basic scientists, or international physicians without US board certification will not appear in the pool (estimated 185 of 409 no-match authors).</w:t>
+      </w:r>
+    </w:p>
+    <w:p>
+      <w:pPr>
+        <w:numPr>
+          <w:ilvl w:val="0"/>
+          <w:numId w:val="1006"/>
+        </w:numPr>
+      </w:pPr>
+      <w:r>
+        <w:rPr>
+          <w:b/>
+          <w:bCs/>
+        </w:rPr>
+        <w:t xml:space="preserve">Name changes.</w:t>
+      </w:r>
+      <w:r>
+        <w:t xml:space="preserve"> </w:t>
+      </w:r>
+      <w:r>
+        <w:t xml:space="preserve">Authors who changed surnames (e.g., after marriage) between abstract presentation and ABOG certification will not match unless the ABOG record reflects the name used at the time of presentation.</w:t>
+      </w:r>
+    </w:p>
+    <w:p>
+      <w:pPr>
+        <w:numPr>
+          <w:ilvl w:val="0"/>
+          <w:numId w:val="1006"/>
+        </w:numPr>
+      </w:pPr>
+      <w:r>
+        <w:rPr>
+          <w:b/>
+          <w:bCs/>
+        </w:rPr>
+        <w:t xml:space="preserve">Single-candidate relaxation risk.</w:t>
+      </w:r>
+      <w:r>
+        <w:t xml:space="preserve"> </w:t>
+      </w:r>
+      <w:r>
+        <w:t xml:space="preserve">While the sole-candidate assumption is probabilistically sound, it is possible for a name collision to occur with a non-presenting physician who happens to share the same uncommon name and initial. The 35-point minimum score guard and downstream manual audit mitigate this risk.</w:t>
+      </w:r>
+    </w:p>
+    <w:bookmarkEnd w:id="52"/>
+    <w:bookmarkEnd w:id="53"/>
     <w:sectPr>
       <w:footnotePr>
         <w:numRestart w:val="eachSect"/>
@@ -5471,6 +6516,66 @@
   </w:num>
   <w:num w:numId="1004">
     <w:abstractNumId w:val="991"/>
+  </w:num>
+  <w:num w:numId="1005">
+    <w:abstractNumId w:val="99411"/>
+    <w:lvlOverride w:ilvl="0">
+      <w:startOverride w:val="1"/>
+    </w:lvlOverride>
+    <w:lvlOverride w:ilvl="1">
+      <w:startOverride w:val="1"/>
+    </w:lvlOverride>
+    <w:lvlOverride w:ilvl="2">
+      <w:startOverride w:val="1"/>
+    </w:lvlOverride>
+    <w:lvlOverride w:ilvl="3">
+      <w:startOverride w:val="1"/>
+    </w:lvlOverride>
+    <w:lvlOverride w:ilvl="4">
+      <w:startOverride w:val="1"/>
+    </w:lvlOverride>
+    <w:lvlOverride w:ilvl="5">
+      <w:startOverride w:val="1"/>
+    </w:lvlOverride>
+    <w:lvlOverride w:ilvl="6">
+      <w:startOverride w:val="1"/>
+    </w:lvlOverride>
+    <w:lvlOverride w:ilvl="7">
+      <w:startOverride w:val="1"/>
+    </w:lvlOverride>
+    <w:lvlOverride w:ilvl="8">
+      <w:startOverride w:val="1"/>
+    </w:lvlOverride>
+  </w:num>
+  <w:num w:numId="1006">
+    <w:abstractNumId w:val="99411"/>
+    <w:lvlOverride w:ilvl="0">
+      <w:startOverride w:val="1"/>
+    </w:lvlOverride>
+    <w:lvlOverride w:ilvl="1">
+      <w:startOverride w:val="1"/>
+    </w:lvlOverride>
+    <w:lvlOverride w:ilvl="2">
+      <w:startOverride w:val="1"/>
+    </w:lvlOverride>
+    <w:lvlOverride w:ilvl="3">
+      <w:startOverride w:val="1"/>
+    </w:lvlOverride>
+    <w:lvlOverride w:ilvl="4">
+      <w:startOverride w:val="1"/>
+    </w:lvlOverride>
+    <w:lvlOverride w:ilvl="5">
+      <w:startOverride w:val="1"/>
+    </w:lvlOverride>
+    <w:lvlOverride w:ilvl="6">
+      <w:startOverride w:val="1"/>
+    </w:lvlOverride>
+    <w:lvlOverride w:ilvl="7">
+      <w:startOverride w:val="1"/>
+    </w:lvlOverride>
+    <w:lvlOverride w:ilvl="8">
+      <w:startOverride w:val="1"/>
+    </w:lvlOverride>
   </w:num>
 </w:numbering>
 </file>

</xml_diff>